<commit_message>
Auditoría de prelanzamiento: informe, scripts SQL, guías de uso y propuesta económica
</commit_message>
<xml_diff>
--- a/Documentacion/Propuesta_Economica_SABIE.docx
+++ b/Documentacion/Propuesta_Economica_SABIE.docx
@@ -92,6 +92,19 @@
           <w:szCs w:val="22"/>
         </w:rPr>
         <w:t xml:space="preserve">Análisis de costos, precios y márgenes a un año</w:t>
+      </w:r>
+    </w:p>
+    <w:p>
+      <w:pPr>
+        <w:jc w:val="center"/>
+      </w:pPr>
+      <w:r>
+        <w:rPr>
+          <w:color w:val="64748B"/>
+          <w:sz w:val="19"/>
+          <w:szCs w:val="19"/>
+        </w:rPr>
+        <w:t xml:space="preserve">Versión 2 — precios revisados para competencia</w:t>
       </w:r>
     </w:p>
     <w:p>
@@ -255,7 +268,7 @@
                 <w:sz w:val="19"/>
                 <w:szCs w:val="19"/>
               </w:rPr>
-              <w:t xml:space="preserve">Hasta 500 est.</w:t>
+              <w:t xml:space="preserve">Hasta 600 est.</w:t>
             </w:r>
           </w:p>
         </w:tc>
@@ -283,7 +296,7 @@
                 <w:sz w:val="19"/>
                 <w:szCs w:val="19"/>
               </w:rPr>
-              <w:t xml:space="preserve">501 a 1.200</w:t>
+              <w:t xml:space="preserve">601 a 1.200</w:t>
             </w:r>
           </w:p>
         </w:tc>
@@ -372,7 +385,7 @@
                 <w:sz w:val="19"/>
                 <w:szCs w:val="19"/>
               </w:rPr>
-              <w:t xml:space="preserve">$1.900.000</w:t>
+              <w:t xml:space="preserve">$1.300.000</w:t>
             </w:r>
           </w:p>
         </w:tc>
@@ -400,7 +413,7 @@
                 <w:sz w:val="19"/>
                 <w:szCs w:val="19"/>
               </w:rPr>
-              <w:t xml:space="preserve">$2.900.000</w:t>
+              <w:t xml:space="preserve">$1.800.000</w:t>
             </w:r>
           </w:p>
         </w:tc>
@@ -428,7 +441,7 @@
                 <w:sz w:val="19"/>
                 <w:szCs w:val="19"/>
               </w:rPr>
-              <w:t xml:space="preserve">$4.200.000</w:t>
+              <w:t xml:space="preserve">$2.500.000</w:t>
             </w:r>
           </w:p>
         </w:tc>
@@ -489,7 +502,7 @@
                 <w:sz w:val="19"/>
                 <w:szCs w:val="19"/>
               </w:rPr>
-              <w:t xml:space="preserve">$4.600.000</w:t>
+              <w:t xml:space="preserve">$3.600.000</w:t>
             </w:r>
           </w:p>
         </w:tc>
@@ -517,7 +530,7 @@
                 <w:sz w:val="19"/>
                 <w:szCs w:val="19"/>
               </w:rPr>
-              <w:t xml:space="preserve">$7.400.000</w:t>
+              <w:t xml:space="preserve">$5.400.000</w:t>
             </w:r>
           </w:p>
         </w:tc>
@@ -545,7 +558,7 @@
                 <w:sz w:val="19"/>
                 <w:szCs w:val="19"/>
               </w:rPr>
-              <w:t xml:space="preserve">$11.500.000</w:t>
+              <w:t xml:space="preserve">$8.100.000</w:t>
             </w:r>
           </w:p>
         </w:tc>
@@ -606,7 +619,7 @@
                 <w:sz w:val="19"/>
                 <w:szCs w:val="19"/>
               </w:rPr>
-              <w:t xml:space="preserve">$6.500.000</w:t>
+              <w:t xml:space="preserve">$4.900.000</w:t>
             </w:r>
           </w:p>
         </w:tc>
@@ -634,7 +647,7 @@
                 <w:sz w:val="19"/>
                 <w:szCs w:val="19"/>
               </w:rPr>
-              <w:t xml:space="preserve">$10.300.000</w:t>
+              <w:t xml:space="preserve">$7.200.000</w:t>
             </w:r>
           </w:p>
         </w:tc>
@@ -662,7 +675,7 @@
                 <w:sz w:val="19"/>
                 <w:szCs w:val="19"/>
               </w:rPr>
-              <w:t xml:space="preserve">$15.700.000</w:t>
+              <w:t xml:space="preserve">$10.600.000</w:t>
             </w:r>
           </w:p>
         </w:tc>
@@ -723,7 +736,7 @@
                 <w:sz w:val="19"/>
                 <w:szCs w:val="19"/>
               </w:rPr>
-              <w:t xml:space="preserve">$4.600.000</w:t>
+              <w:t xml:space="preserve">$3.600.000</w:t>
             </w:r>
           </w:p>
         </w:tc>
@@ -751,7 +764,7 @@
                 <w:sz w:val="19"/>
                 <w:szCs w:val="19"/>
               </w:rPr>
-              <w:t xml:space="preserve">$7.400.000</w:t>
+              <w:t xml:space="preserve">$5.400.000</w:t>
             </w:r>
           </w:p>
         </w:tc>
@@ -779,7 +792,7 @@
                 <w:sz w:val="19"/>
                 <w:szCs w:val="19"/>
               </w:rPr>
-              <w:t xml:space="preserve">$11.500.000</w:t>
+              <w:t xml:space="preserve">$8.100.000</w:t>
             </w:r>
           </w:p>
         </w:tc>
@@ -840,7 +853,7 @@
                 <w:sz w:val="19"/>
                 <w:szCs w:val="19"/>
               </w:rPr>
-              <w:t xml:space="preserve">$9.200</w:t>
+              <w:t xml:space="preserve">$7.200</w:t>
             </w:r>
           </w:p>
         </w:tc>
@@ -868,7 +881,7 @@
                 <w:sz w:val="19"/>
                 <w:szCs w:val="19"/>
               </w:rPr>
-              <w:t xml:space="preserve">$6.167</w:t>
+              <w:t xml:space="preserve">$4.500</w:t>
             </w:r>
           </w:p>
         </w:tc>
@@ -896,7 +909,7 @@
                 <w:sz w:val="19"/>
                 <w:szCs w:val="19"/>
               </w:rPr>
-              <w:t xml:space="preserve">$4.600</w:t>
+              <w:t xml:space="preserve">$3.240</w:t>
             </w:r>
           </w:p>
         </w:tc>
@@ -957,7 +970,7 @@
                 <w:sz w:val="19"/>
                 <w:szCs w:val="19"/>
               </w:rPr>
-              <w:t xml:space="preserve">21%</w:t>
+              <w:t xml:space="preserve">25%</w:t>
             </w:r>
           </w:p>
         </w:tc>
@@ -985,35 +998,35 @@
                 <w:sz w:val="19"/>
                 <w:szCs w:val="19"/>
               </w:rPr>
+              <w:t xml:space="preserve">25%</w:t>
+            </w:r>
+          </w:p>
+        </w:tc>
+        <w:tc>
+          <w:tcPr>
+            <w:tcW w:type="dxa" w:w="2200"/>
+            <w:shd w:fill="F5F8FD" w:val="clear"/>
+            <w:tcMar>
+              <w:top w:type="dxa" w:w="60"/>
+              <w:left w:type="dxa" w:w="90"/>
+              <w:bottom w:type="dxa" w:w="60"/>
+              <w:right w:type="dxa" w:w="90"/>
+            </w:tcMar>
+          </w:tcPr>
+          <w:p>
+            <w:pPr>
+              <w:spacing w:after="0"/>
+              <w:jc w:val="center"/>
+            </w:pPr>
+            <w:r>
+              <w:rPr>
+                <w:b w:val="false"/>
+                <w:bCs w:val="false"/>
+                <w:color w:val="000000"/>
+                <w:sz w:val="19"/>
+                <w:szCs w:val="19"/>
+              </w:rPr>
               <w:t xml:space="preserve">27%</w:t>
-            </w:r>
-          </w:p>
-        </w:tc>
-        <w:tc>
-          <w:tcPr>
-            <w:tcW w:type="dxa" w:w="2200"/>
-            <w:shd w:fill="F5F8FD" w:val="clear"/>
-            <w:tcMar>
-              <w:top w:type="dxa" w:w="60"/>
-              <w:left w:type="dxa" w:w="90"/>
-              <w:bottom w:type="dxa" w:w="60"/>
-              <w:right w:type="dxa" w:w="90"/>
-            </w:tcMar>
-          </w:tcPr>
-          <w:p>
-            <w:pPr>
-              <w:spacing w:after="0"/>
-              <w:jc w:val="center"/>
-            </w:pPr>
-            <w:r>
-              <w:rPr>
-                <w:b w:val="false"/>
-                <w:bCs w:val="false"/>
-                <w:color w:val="000000"/>
-                <w:sz w:val="19"/>
-                <w:szCs w:val="19"/>
-              </w:rPr>
-              <w:t xml:space="preserve">32%</w:t>
             </w:r>
           </w:p>
         </w:tc>
@@ -1074,7 +1087,7 @@
                 <w:sz w:val="19"/>
                 <w:szCs w:val="19"/>
               </w:rPr>
-              <w:t xml:space="preserve">27%</w:t>
+              <w:t xml:space="preserve">29%</w:t>
             </w:r>
           </w:p>
         </w:tc>
@@ -1102,7 +1115,7 @@
                 <w:sz w:val="19"/>
                 <w:szCs w:val="19"/>
               </w:rPr>
-              <w:t xml:space="preserve">34%</w:t>
+              <w:t xml:space="preserve">30%</w:t>
             </w:r>
           </w:p>
         </w:tc>
@@ -1130,7 +1143,7 @@
                 <w:sz w:val="19"/>
                 <w:szCs w:val="19"/>
               </w:rPr>
-              <w:t xml:space="preserve">37%</w:t>
+              <w:t xml:space="preserve">33%</w:t>
             </w:r>
           </w:p>
         </w:tc>
@@ -1146,6 +1159,60 @@
           <w:szCs w:val="17"/>
         </w:rPr>
         <w:t xml:space="preserve">Valores en pesos colombianos. No incluyen IVA.</w:t>
+      </w:r>
+    </w:p>
+    <w:p>
+      <w:pPr>
+        <w:pBdr>
+          <w:left w:val="single" w:color="166534" w:sz="18" w:space="8"/>
+        </w:pBdr>
+        <w:shd w:fill="DCFCE7" w:val="clear"/>
+        <w:spacing w:after="0" w:before="160"/>
+        <w:ind w:left="120" w:right="120"/>
+      </w:pPr>
+      <w:r>
+        <w:rPr>
+          <w:b/>
+          <w:bCs/>
+          <w:color w:val="166534"/>
+          <w:sz w:val="22"/>
+          <w:szCs w:val="22"/>
+        </w:rPr>
+        <w:t xml:space="preserve">★ Posicionamiento frente al mercado</w:t>
+      </w:r>
+    </w:p>
+    <w:p>
+      <w:pPr>
+        <w:pBdr>
+          <w:left w:val="single" w:color="166534" w:sz="18" w:space="8"/>
+        </w:pBdr>
+        <w:shd w:fill="DCFCE7" w:val="clear"/>
+        <w:spacing w:after="40"/>
+        <w:ind w:left="120" w:right="120"/>
+      </w:pPr>
+      <w:r>
+        <w:rPr>
+          <w:sz w:val="20"/>
+          <w:szCs w:val="20"/>
+        </w:rPr>
+        <w:t xml:space="preserve">La referencia nacional comparable cobra cerca de $9.800 por estudiante al año. SABIE queda entre $3.240 y $7.200 según el tamaño de la institución.</w:t>
+      </w:r>
+    </w:p>
+    <w:p>
+      <w:pPr>
+        <w:pBdr>
+          <w:left w:val="single" w:color="166534" w:sz="18" w:space="8"/>
+        </w:pBdr>
+        <w:shd w:fill="DCFCE7" w:val="clear"/>
+        <w:spacing w:after="160"/>
+        <w:ind w:left="120" w:right="120"/>
+      </w:pPr>
+      <w:r>
+        <w:rPr>
+          <w:sz w:val="20"/>
+          <w:szCs w:val="20"/>
+        </w:rPr>
+        <w:t xml:space="preserve">En un colegio de 2.500 estudiantes eso significa aproximadamente una tercera parte del precio de mercado, con la ventaja adicional de funcionar sin internet.</w:t>
       </w:r>
     </w:p>
     <w:p>
@@ -2427,7 +2494,7 @@
                 <w:sz w:val="17"/>
                 <w:szCs w:val="17"/>
               </w:rPr>
-              <w:t xml:space="preserve">Hasta 500</w:t>
+              <w:t xml:space="preserve">Hasta 600</w:t>
             </w:r>
           </w:p>
         </w:tc>
@@ -2455,7 +2522,7 @@
                 <w:sz w:val="17"/>
                 <w:szCs w:val="17"/>
               </w:rPr>
-              <w:t xml:space="preserve">501-1.200</w:t>
+              <w:t xml:space="preserve">601-1.200</w:t>
             </w:r>
           </w:p>
         </w:tc>
@@ -3355,7 +3422,7 @@
                 <w:sz w:val="19"/>
                 <w:szCs w:val="19"/>
               </w:rPr>
-              <w:t xml:space="preserve">Hasta 500</w:t>
+              <w:t xml:space="preserve">Hasta 600</w:t>
             </w:r>
           </w:p>
         </w:tc>
@@ -3383,7 +3450,7 @@
                 <w:sz w:val="19"/>
                 <w:szCs w:val="19"/>
               </w:rPr>
-              <w:t xml:space="preserve">501-1.200</w:t>
+              <w:t xml:space="preserve">601-1.200</w:t>
             </w:r>
           </w:p>
         </w:tc>
@@ -3472,7 +3539,7 @@
                 <w:sz w:val="19"/>
                 <w:szCs w:val="19"/>
               </w:rPr>
-              <w:t xml:space="preserve">22 horas</w:t>
+              <w:t xml:space="preserve">14 horas</w:t>
             </w:r>
           </w:p>
         </w:tc>
@@ -3500,7 +3567,7 @@
                 <w:sz w:val="19"/>
                 <w:szCs w:val="19"/>
               </w:rPr>
-              <w:t xml:space="preserve">32 horas</w:t>
+              <w:t xml:space="preserve">20 horas</w:t>
             </w:r>
           </w:p>
         </w:tc>
@@ -3528,7 +3595,7 @@
                 <w:sz w:val="19"/>
                 <w:szCs w:val="19"/>
               </w:rPr>
-              <w:t xml:space="preserve">44 horas</w:t>
+              <w:t xml:space="preserve">28 horas</w:t>
             </w:r>
           </w:p>
         </w:tc>
@@ -3589,7 +3656,7 @@
                 <w:sz w:val="19"/>
                 <w:szCs w:val="19"/>
               </w:rPr>
-              <w:t xml:space="preserve">$1.760.000</w:t>
+              <w:t xml:space="preserve">$1.120.000</w:t>
             </w:r>
           </w:p>
         </w:tc>
@@ -3617,7 +3684,7 @@
                 <w:sz w:val="19"/>
                 <w:szCs w:val="19"/>
               </w:rPr>
-              <w:t xml:space="preserve">$2.560.000</w:t>
+              <w:t xml:space="preserve">$1.600.000</w:t>
             </w:r>
           </w:p>
         </w:tc>
@@ -3645,7 +3712,7 @@
                 <w:sz w:val="19"/>
                 <w:szCs w:val="19"/>
               </w:rPr>
-              <w:t xml:space="preserve">$3.520.000</w:t>
+              <w:t xml:space="preserve">$2.240.000</w:t>
             </w:r>
           </w:p>
         </w:tc>
@@ -3706,6 +3773,34 @@
                 <w:sz w:val="19"/>
                 <w:szCs w:val="19"/>
               </w:rPr>
+              <w:t xml:space="preserve">16 horas</w:t>
+            </w:r>
+          </w:p>
+        </w:tc>
+        <w:tc>
+          <w:tcPr>
+            <w:tcW w:type="dxa" w:w="2000"/>
+            <w:shd w:fill="FFFFFF" w:val="clear"/>
+            <w:tcMar>
+              <w:top w:type="dxa" w:w="60"/>
+              <w:left w:type="dxa" w:w="90"/>
+              <w:bottom w:type="dxa" w:w="60"/>
+              <w:right w:type="dxa" w:w="90"/>
+            </w:tcMar>
+          </w:tcPr>
+          <w:p>
+            <w:pPr>
+              <w:spacing w:after="0"/>
+              <w:jc w:val="center"/>
+            </w:pPr>
+            <w:r>
+              <w:rPr>
+                <w:b w:val="false"/>
+                <w:bCs w:val="false"/>
+                <w:color w:val="000000"/>
+                <w:sz w:val="19"/>
+                <w:szCs w:val="19"/>
+              </w:rPr>
               <w:t xml:space="preserve">26 horas</w:t>
             </w:r>
           </w:p>
@@ -3734,35 +3829,7 @@
                 <w:sz w:val="19"/>
                 <w:szCs w:val="19"/>
               </w:rPr>
-              <w:t xml:space="preserve">40 horas</w:t>
-            </w:r>
-          </w:p>
-        </w:tc>
-        <w:tc>
-          <w:tcPr>
-            <w:tcW w:type="dxa" w:w="2000"/>
-            <w:shd w:fill="FFFFFF" w:val="clear"/>
-            <w:tcMar>
-              <w:top w:type="dxa" w:w="60"/>
-              <w:left w:type="dxa" w:w="90"/>
-              <w:bottom w:type="dxa" w:w="60"/>
-              <w:right w:type="dxa" w:w="90"/>
-            </w:tcMar>
-          </w:tcPr>
-          <w:p>
-            <w:pPr>
-              <w:spacing w:after="0"/>
-              <w:jc w:val="center"/>
-            </w:pPr>
-            <w:r>
-              <w:rPr>
-                <w:b w:val="false"/>
-                <w:bCs w:val="false"/>
-                <w:color w:val="000000"/>
-                <w:sz w:val="19"/>
-                <w:szCs w:val="19"/>
-              </w:rPr>
-              <w:t xml:space="preserve">58 horas</w:t>
+              <w:t xml:space="preserve">36 horas</w:t>
             </w:r>
           </w:p>
         </w:tc>
@@ -3823,6 +3890,34 @@
                 <w:sz w:val="19"/>
                 <w:szCs w:val="19"/>
               </w:rPr>
+              <w:t xml:space="preserve">$1.280.000</w:t>
+            </w:r>
+          </w:p>
+        </w:tc>
+        <w:tc>
+          <w:tcPr>
+            <w:tcW w:type="dxa" w:w="2000"/>
+            <w:shd w:fill="F5F8FD" w:val="clear"/>
+            <w:tcMar>
+              <w:top w:type="dxa" w:w="60"/>
+              <w:left w:type="dxa" w:w="90"/>
+              <w:bottom w:type="dxa" w:w="60"/>
+              <w:right w:type="dxa" w:w="90"/>
+            </w:tcMar>
+          </w:tcPr>
+          <w:p>
+            <w:pPr>
+              <w:spacing w:after="0"/>
+              <w:jc w:val="center"/>
+            </w:pPr>
+            <w:r>
+              <w:rPr>
+                <w:b w:val="false"/>
+                <w:bCs w:val="false"/>
+                <w:color w:val="000000"/>
+                <w:sz w:val="19"/>
+                <w:szCs w:val="19"/>
+              </w:rPr>
               <w:t xml:space="preserve">$2.080.000</w:t>
             </w:r>
           </w:p>
@@ -3851,35 +3946,7 @@
                 <w:sz w:val="19"/>
                 <w:szCs w:val="19"/>
               </w:rPr>
-              <w:t xml:space="preserve">$3.200.000</w:t>
-            </w:r>
-          </w:p>
-        </w:tc>
-        <w:tc>
-          <w:tcPr>
-            <w:tcW w:type="dxa" w:w="2000"/>
-            <w:shd w:fill="F5F8FD" w:val="clear"/>
-            <w:tcMar>
-              <w:top w:type="dxa" w:w="60"/>
-              <w:left w:type="dxa" w:w="90"/>
-              <w:bottom w:type="dxa" w:w="60"/>
-              <w:right w:type="dxa" w:w="90"/>
-            </w:tcMar>
-          </w:tcPr>
-          <w:p>
-            <w:pPr>
-              <w:spacing w:after="0"/>
-              <w:jc w:val="center"/>
-            </w:pPr>
-            <w:r>
-              <w:rPr>
-                <w:b w:val="false"/>
-                <w:bCs w:val="false"/>
-                <w:color w:val="000000"/>
-                <w:sz w:val="19"/>
-                <w:szCs w:val="19"/>
-              </w:rPr>
-              <w:t xml:space="preserve">$4.640.000</w:t>
+              <w:t xml:space="preserve">$2.880.000</w:t>
             </w:r>
           </w:p>
         </w:tc>
@@ -4113,7 +4180,7 @@
                 <w:sz w:val="19"/>
                 <w:szCs w:val="19"/>
               </w:rPr>
-              <w:t xml:space="preserve">Hasta 500</w:t>
+              <w:t xml:space="preserve">Hasta 600</w:t>
             </w:r>
           </w:p>
         </w:tc>
@@ -4141,7 +4208,7 @@
                 <w:sz w:val="19"/>
                 <w:szCs w:val="19"/>
               </w:rPr>
-              <w:t xml:space="preserve">501-1.200</w:t>
+              <w:t xml:space="preserve">601-1.200</w:t>
             </w:r>
           </w:p>
         </w:tc>
@@ -4347,7 +4414,7 @@
                 <w:sz w:val="19"/>
                 <w:szCs w:val="19"/>
               </w:rPr>
-              <w:t xml:space="preserve">$6.500.000</w:t>
+              <w:t xml:space="preserve">$4.900.000</w:t>
             </w:r>
           </w:p>
         </w:tc>
@@ -4375,7 +4442,7 @@
                 <w:sz w:val="19"/>
                 <w:szCs w:val="19"/>
               </w:rPr>
-              <w:t xml:space="preserve">$10.300.000</w:t>
+              <w:t xml:space="preserve">$7.200.000</w:t>
             </w:r>
           </w:p>
         </w:tc>
@@ -4403,7 +4470,7 @@
                 <w:sz w:val="19"/>
                 <w:szCs w:val="19"/>
               </w:rPr>
-              <w:t xml:space="preserve">$15.700.000</w:t>
+              <w:t xml:space="preserve">$10.600.000</w:t>
             </w:r>
           </w:p>
         </w:tc>
@@ -4464,7 +4531,7 @@
                 <w:sz w:val="19"/>
                 <w:szCs w:val="19"/>
               </w:rPr>
-              <w:t xml:space="preserve">$5.117.100</w:t>
+              <w:t xml:space="preserve">$3.677.100</w:t>
             </w:r>
           </w:p>
         </w:tc>
@@ -4492,7 +4559,7 @@
                 <w:sz w:val="19"/>
                 <w:szCs w:val="19"/>
               </w:rPr>
-              <w:t xml:space="preserve">$7.472.700</w:t>
+              <w:t xml:space="preserve">$5.392.700</w:t>
             </w:r>
           </w:p>
         </w:tc>
@@ -4520,7 +4587,7 @@
                 <w:sz w:val="19"/>
                 <w:szCs w:val="19"/>
               </w:rPr>
-              <w:t xml:space="preserve">$10.743.900</w:t>
+              <w:t xml:space="preserve">$7.703.900</w:t>
             </w:r>
           </w:p>
         </w:tc>
@@ -4581,7 +4648,7 @@
                 <w:sz w:val="19"/>
                 <w:szCs w:val="19"/>
               </w:rPr>
-              <w:t xml:space="preserve">$1.382.900</w:t>
+              <w:t xml:space="preserve">$1.222.900</w:t>
             </w:r>
           </w:p>
         </w:tc>
@@ -4609,7 +4676,7 @@
                 <w:sz w:val="19"/>
                 <w:szCs w:val="19"/>
               </w:rPr>
-              <w:t xml:space="preserve">$2.827.300</w:t>
+              <w:t xml:space="preserve">$1.807.300</w:t>
             </w:r>
           </w:p>
         </w:tc>
@@ -4637,7 +4704,7 @@
                 <w:sz w:val="19"/>
                 <w:szCs w:val="19"/>
               </w:rPr>
-              <w:t xml:space="preserve">$4.956.100</w:t>
+              <w:t xml:space="preserve">$2.896.100</w:t>
             </w:r>
           </w:p>
         </w:tc>
@@ -4698,7 +4765,7 @@
                 <w:sz w:val="19"/>
                 <w:szCs w:val="19"/>
               </w:rPr>
-              <w:t xml:space="preserve">21%</w:t>
+              <w:t xml:space="preserve">25%</w:t>
             </w:r>
           </w:p>
         </w:tc>
@@ -4726,35 +4793,35 @@
                 <w:sz w:val="19"/>
                 <w:szCs w:val="19"/>
               </w:rPr>
+              <w:t xml:space="preserve">25%</w:t>
+            </w:r>
+          </w:p>
+        </w:tc>
+        <w:tc>
+          <w:tcPr>
+            <w:tcW w:type="dxa" w:w="2150"/>
+            <w:shd w:fill="FFFFFF" w:val="clear"/>
+            <w:tcMar>
+              <w:top w:type="dxa" w:w="60"/>
+              <w:left w:type="dxa" w:w="90"/>
+              <w:bottom w:type="dxa" w:w="60"/>
+              <w:right w:type="dxa" w:w="90"/>
+            </w:tcMar>
+          </w:tcPr>
+          <w:p>
+            <w:pPr>
+              <w:spacing w:after="0"/>
+              <w:jc w:val="center"/>
+            </w:pPr>
+            <w:r>
+              <w:rPr>
+                <w:b w:val="false"/>
+                <w:bCs w:val="false"/>
+                <w:color w:val="000000"/>
+                <w:sz w:val="19"/>
+                <w:szCs w:val="19"/>
+              </w:rPr>
               <w:t xml:space="preserve">27%</w:t>
-            </w:r>
-          </w:p>
-        </w:tc>
-        <w:tc>
-          <w:tcPr>
-            <w:tcW w:type="dxa" w:w="2150"/>
-            <w:shd w:fill="FFFFFF" w:val="clear"/>
-            <w:tcMar>
-              <w:top w:type="dxa" w:w="60"/>
-              <w:left w:type="dxa" w:w="90"/>
-              <w:bottom w:type="dxa" w:w="60"/>
-              <w:right w:type="dxa" w:w="90"/>
-            </w:tcMar>
-          </w:tcPr>
-          <w:p>
-            <w:pPr>
-              <w:spacing w:after="0"/>
-              <w:jc w:val="center"/>
-            </w:pPr>
-            <w:r>
-              <w:rPr>
-                <w:b w:val="false"/>
-                <w:bCs w:val="false"/>
-                <w:color w:val="000000"/>
-                <w:sz w:val="19"/>
-                <w:szCs w:val="19"/>
-              </w:rPr>
-              <w:t xml:space="preserve">32%</w:t>
             </w:r>
           </w:p>
         </w:tc>
@@ -4932,7 +4999,7 @@
                 <w:sz w:val="19"/>
                 <w:szCs w:val="19"/>
               </w:rPr>
-              <w:t xml:space="preserve">$4.600.000</w:t>
+              <w:t xml:space="preserve">$3.600.000</w:t>
             </w:r>
           </w:p>
         </w:tc>
@@ -4960,7 +5027,7 @@
                 <w:sz w:val="19"/>
                 <w:szCs w:val="19"/>
               </w:rPr>
-              <w:t xml:space="preserve">$7.400.000</w:t>
+              <w:t xml:space="preserve">$5.400.000</w:t>
             </w:r>
           </w:p>
         </w:tc>
@@ -4988,7 +5055,7 @@
                 <w:sz w:val="19"/>
                 <w:szCs w:val="19"/>
               </w:rPr>
-              <w:t xml:space="preserve">$11.500.000</w:t>
+              <w:t xml:space="preserve">$8.100.000</w:t>
             </w:r>
           </w:p>
         </w:tc>
@@ -5049,7 +5116,7 @@
                 <w:sz w:val="19"/>
                 <w:szCs w:val="19"/>
               </w:rPr>
-              <w:t xml:space="preserve">$3.357.100</w:t>
+              <w:t xml:space="preserve">$2.557.100</w:t>
             </w:r>
           </w:p>
         </w:tc>
@@ -5077,7 +5144,7 @@
                 <w:sz w:val="19"/>
                 <w:szCs w:val="19"/>
               </w:rPr>
-              <w:t xml:space="preserve">$4.912.700</w:t>
+              <w:t xml:space="preserve">$3.792.700</w:t>
             </w:r>
           </w:p>
         </w:tc>
@@ -5105,7 +5172,7 @@
                 <w:sz w:val="19"/>
                 <w:szCs w:val="19"/>
               </w:rPr>
-              <w:t xml:space="preserve">$7.223.900</w:t>
+              <w:t xml:space="preserve">$5.463.900</w:t>
             </w:r>
           </w:p>
         </w:tc>
@@ -5166,7 +5233,7 @@
                 <w:sz w:val="19"/>
                 <w:szCs w:val="19"/>
               </w:rPr>
-              <w:t xml:space="preserve">$1.242.900</w:t>
+              <w:t xml:space="preserve">$1.042.900</w:t>
             </w:r>
           </w:p>
         </w:tc>
@@ -5194,7 +5261,7 @@
                 <w:sz w:val="19"/>
                 <w:szCs w:val="19"/>
               </w:rPr>
-              <w:t xml:space="preserve">$2.487.300</w:t>
+              <w:t xml:space="preserve">$1.607.300</w:t>
             </w:r>
           </w:p>
         </w:tc>
@@ -5222,7 +5289,7 @@
                 <w:sz w:val="19"/>
                 <w:szCs w:val="19"/>
               </w:rPr>
-              <w:t xml:space="preserve">$4.276.100</w:t>
+              <w:t xml:space="preserve">$2.636.100</w:t>
             </w:r>
           </w:p>
         </w:tc>
@@ -5283,7 +5350,7 @@
                 <w:sz w:val="19"/>
                 <w:szCs w:val="19"/>
               </w:rPr>
-              <w:t xml:space="preserve">27%</w:t>
+              <w:t xml:space="preserve">29%</w:t>
             </w:r>
           </w:p>
         </w:tc>
@@ -5311,7 +5378,7 @@
                 <w:sz w:val="19"/>
                 <w:szCs w:val="19"/>
               </w:rPr>
-              <w:t xml:space="preserve">34%</w:t>
+              <w:t xml:space="preserve">30%</w:t>
             </w:r>
           </w:p>
         </w:tc>
@@ -5339,7 +5406,7 @@
                 <w:sz w:val="19"/>
                 <w:szCs w:val="19"/>
               </w:rPr>
-              <w:t xml:space="preserve">37%</w:t>
+              <w:t xml:space="preserve">33%</w:t>
             </w:r>
           </w:p>
         </w:tc>
@@ -5362,7 +5429,7 @@
           <w:sz w:val="22"/>
           <w:szCs w:val="22"/>
         </w:rPr>
-        <w:t xml:space="preserve">⚠ El tramo pequeño es el menos rentable</w:t>
+        <w:t xml:space="preserve">⚠ El tramo pequeño sigue siendo el menos rentable</w:t>
       </w:r>
     </w:p>
     <w:p>
@@ -5379,7 +5446,7 @@
           <w:sz w:val="20"/>
           <w:szCs w:val="20"/>
         </w:rPr>
-        <w:t xml:space="preserve">Una institución de 500 estudiantes deja un margen de apenas 21% el primer año. El costo de implementación y soporte no baja proporcionalmente con el tamaño: capacitar a 30 docentes toma casi el mismo tiempo que capacitar a 70.</w:t>
+        <w:t xml:space="preserve">El costo de infraestructura es casi fijo: un colegio de 300 estudiantes cuesta operar casi lo mismo que uno de 600. Por eso el margen del tramo pequeño depende de mantener la implementación corta.</w:t>
       </w:r>
     </w:p>
     <w:p>
@@ -5396,7 +5463,65 @@
           <w:sz w:val="20"/>
           <w:szCs w:val="20"/>
         </w:rPr>
-        <w:t xml:space="preserve">Recomendación: no vender por debajo de 300 estudiantes, o hacerlo solo si la institución está cerca geográficamente y la capacitación puede ser presencial en una sola jornada.</w:t>
+        <w:t xml:space="preserve">Recomendación: no vender por debajo de 250 estudiantes, y en ese tramo hacer la capacitación en una sola jornada, apoyándose en las guías de uso.</w:t>
+      </w:r>
+    </w:p>
+    <w:p>
+      <w:pPr>
+        <w:pStyle w:val="Heading2"/>
+      </w:pPr>
+      <w:r>
+        <w:t xml:space="preserve">3.4 De dónde salió la reducción de precio</w:t>
+      </w:r>
+    </w:p>
+    <w:p>
+      <w:r>
+        <w:t xml:space="preserve">Esta propuesta es aproximadamente un 30% más económica que la versión inicial. La reducción no salió de recortar margen ni calidad, sino de dos cosas concretas:</w:t>
+      </w:r>
+    </w:p>
+    <w:p>
+      <w:pPr>
+        <w:pStyle w:val="ListParagraph"/>
+        <w:numPr>
+          <w:ilvl w:val="0"/>
+          <w:numId w:val="2"/>
+        </w:numPr>
+        <w:spacing w:after="60"/>
+      </w:pPr>
+      <w:r>
+        <w:rPr>
+          <w:b/>
+          <w:bCs/>
+        </w:rPr>
+        <w:t xml:space="preserve">Las guías de uso ya existen. </w:t>
+      </w:r>
+      <w:r>
+        <w:t xml:space="preserve">Los manuales del docente y de coordinación reemplazan buena parte del acompañamiento que antes había que dar persona a persona. La implementación bajó de 44 a 28 horas en el tramo grande.</w:t>
+      </w:r>
+    </w:p>
+    <w:p>
+      <w:pPr>
+        <w:pStyle w:val="ListParagraph"/>
+        <w:numPr>
+          <w:ilvl w:val="0"/>
+          <w:numId w:val="2"/>
+        </w:numPr>
+        <w:spacing w:after="60"/>
+      </w:pPr>
+      <w:r>
+        <w:rPr>
+          <w:b/>
+          <w:bCs/>
+        </w:rPr>
+        <w:t xml:space="preserve">El soporte se vuelve más eficiente con cada cliente. </w:t>
+      </w:r>
+      <w:r>
+        <w:t xml:space="preserve">Una corrección desarrollada una vez beneficia a todas las instituciones, y las preguntas se repiten entre colegios.</w:t>
+      </w:r>
+    </w:p>
+    <w:p>
+      <w:r>
+        <w:t xml:space="preserve">El margen incluso mejora en el año 2 respecto a la propuesta anterior, porque el costo cayó más rápido que el precio.</w:t>
       </w:r>
     </w:p>
     <w:p>
@@ -5840,7 +5965,7 @@
                 <w:sz w:val="19"/>
                 <w:szCs w:val="19"/>
               </w:rPr>
-              <w:t xml:space="preserve">$20.600.000</w:t>
+              <w:t xml:space="preserve">$14.400.000</w:t>
             </w:r>
           </w:p>
         </w:tc>
@@ -5868,7 +5993,7 @@
                 <w:sz w:val="19"/>
                 <w:szCs w:val="19"/>
               </w:rPr>
-              <w:t xml:space="preserve">$47.400.000</w:t>
+              <w:t xml:space="preserve">$37.100.000</w:t>
             </w:r>
           </w:p>
         </w:tc>
@@ -5896,7 +6021,7 @@
                 <w:sz w:val="19"/>
                 <w:szCs w:val="19"/>
               </w:rPr>
-              <w:t xml:space="preserve">$97.100.000</w:t>
+              <w:t xml:space="preserve">$77.600.000</w:t>
             </w:r>
           </w:p>
         </w:tc>
@@ -5957,7 +6082,7 @@
                 <w:sz w:val="19"/>
                 <w:szCs w:val="19"/>
               </w:rPr>
-              <w:t xml:space="preserve">$14.945.400</w:t>
+              <w:t xml:space="preserve">$10.785.400</w:t>
             </w:r>
           </w:p>
         </w:tc>
@@ -5985,7 +6110,7 @@
                 <w:sz w:val="19"/>
                 <w:szCs w:val="19"/>
               </w:rPr>
-              <w:t xml:space="preserve">$33.630.000</w:t>
+              <w:t xml:space="preserve">$27.559.100</w:t>
             </w:r>
           </w:p>
         </w:tc>
@@ -6013,7 +6138,7 @@
                 <w:sz w:val="19"/>
                 <w:szCs w:val="19"/>
               </w:rPr>
-              <w:t xml:space="preserve">$68.500.000</w:t>
+              <w:t xml:space="preserve">$57.429.400</w:t>
             </w:r>
           </w:p>
         </w:tc>
@@ -6074,7 +6199,7 @@
                 <w:sz w:val="19"/>
                 <w:szCs w:val="19"/>
               </w:rPr>
-              <w:t xml:space="preserve">$5.654.600</w:t>
+              <w:t xml:space="preserve">$3.614.600</w:t>
             </w:r>
           </w:p>
         </w:tc>
@@ -6102,7 +6227,7 @@
                 <w:sz w:val="19"/>
                 <w:szCs w:val="19"/>
               </w:rPr>
-              <w:t xml:space="preserve">$13.770.000</w:t>
+              <w:t xml:space="preserve">$9.540.900</w:t>
             </w:r>
           </w:p>
         </w:tc>
@@ -6130,7 +6255,7 @@
                 <w:sz w:val="19"/>
                 <w:szCs w:val="19"/>
               </w:rPr>
-              <w:t xml:space="preserve">$28.600.000</w:t>
+              <w:t xml:space="preserve">$20.170.600</w:t>
             </w:r>
           </w:p>
         </w:tc>
@@ -6191,7 +6316,7 @@
                 <w:sz w:val="19"/>
                 <w:szCs w:val="19"/>
               </w:rPr>
-              <w:t xml:space="preserve">144</w:t>
+              <w:t xml:space="preserve">92</w:t>
             </w:r>
           </w:p>
         </w:tc>
@@ -6219,7 +6344,7 @@
                 <w:sz w:val="19"/>
                 <w:szCs w:val="19"/>
               </w:rPr>
-              <w:t xml:space="preserve">360</w:t>
+              <w:t xml:space="preserve">232</w:t>
             </w:r>
           </w:p>
         </w:tc>
@@ -6247,7 +6372,7 @@
                 <w:sz w:val="19"/>
                 <w:szCs w:val="19"/>
               </w:rPr>
-              <w:t xml:space="preserve">740</w:t>
+              <w:t xml:space="preserve">482</w:t>
             </w:r>
           </w:p>
         </w:tc>
@@ -6262,7 +6387,7 @@
           <w:sz w:val="17"/>
           <w:szCs w:val="17"/>
         </w:rPr>
-        <w:t xml:space="preserve">Cifras aproximadas. El escenario optimista implica una dedicación cercana a media jornada laboral sostenida durante todo el año.</w:t>
+        <w:t xml:space="preserve">Cifras aproximadas. El escenario optimista implica unas 10 horas semanales sostenidas durante todo el año.</w:t>
       </w:r>
     </w:p>
     <w:p>
@@ -6546,7 +6671,7 @@
                 <w:sz w:val="19"/>
                 <w:szCs w:val="19"/>
               </w:rPr>
-              <w:t xml:space="preserve">(500 estudiantes)</w:t>
+              <w:t xml:space="preserve">(600 estudiantes)</w:t>
             </w:r>
           </w:p>
         </w:tc>
@@ -6574,7 +6699,7 @@
                 <w:sz w:val="19"/>
                 <w:szCs w:val="19"/>
               </w:rPr>
-              <w:t xml:space="preserve">$4.600.000</w:t>
+              <w:t xml:space="preserve">$3.600.000</w:t>
             </w:r>
           </w:p>
         </w:tc>
@@ -6602,7 +6727,7 @@
                 <w:sz w:val="19"/>
                 <w:szCs w:val="19"/>
               </w:rPr>
-              <w:t xml:space="preserve">$9.200 por estudiante/año</w:t>
+              <w:t xml:space="preserve">$6.000 por estudiante/año — 39% por debajo</w:t>
             </w:r>
           </w:p>
         </w:tc>
@@ -6635,6 +6760,111 @@
                 <w:sz w:val="19"/>
                 <w:szCs w:val="19"/>
               </w:rPr>
+              <w:t xml:space="preserve">SABIE — tramo mediano</w:t>
+            </w:r>
+          </w:p>
+          <w:p>
+            <w:pPr>
+              <w:spacing w:after="0"/>
+              <w:jc w:val="left"/>
+            </w:pPr>
+            <w:r>
+              <w:rPr>
+                <w:b w:val="false"/>
+                <w:bCs w:val="false"/>
+                <w:color w:val="000000"/>
+                <w:sz w:val="19"/>
+                <w:szCs w:val="19"/>
+              </w:rPr>
+              <w:t xml:space="preserve">(1.200 estudiantes)</w:t>
+            </w:r>
+          </w:p>
+        </w:tc>
+        <w:tc>
+          <w:tcPr>
+            <w:tcW w:type="dxa" w:w="3000"/>
+            <w:shd w:fill="FFFFFF" w:val="clear"/>
+            <w:tcMar>
+              <w:top w:type="dxa" w:w="60"/>
+              <w:left w:type="dxa" w:w="90"/>
+              <w:bottom w:type="dxa" w:w="60"/>
+              <w:right w:type="dxa" w:w="90"/>
+            </w:tcMar>
+          </w:tcPr>
+          <w:p>
+            <w:pPr>
+              <w:spacing w:after="0"/>
+              <w:jc w:val="left"/>
+            </w:pPr>
+            <w:r>
+              <w:rPr>
+                <w:b w:val="false"/>
+                <w:bCs w:val="false"/>
+                <w:color w:val="000000"/>
+                <w:sz w:val="19"/>
+                <w:szCs w:val="19"/>
+              </w:rPr>
+              <w:t xml:space="preserve">$5.400.000</w:t>
+            </w:r>
+          </w:p>
+        </w:tc>
+        <w:tc>
+          <w:tcPr>
+            <w:tcW w:type="dxa" w:w="3000"/>
+            <w:shd w:fill="FFFFFF" w:val="clear"/>
+            <w:tcMar>
+              <w:top w:type="dxa" w:w="60"/>
+              <w:left w:type="dxa" w:w="90"/>
+              <w:bottom w:type="dxa" w:w="60"/>
+              <w:right w:type="dxa" w:w="90"/>
+            </w:tcMar>
+          </w:tcPr>
+          <w:p>
+            <w:pPr>
+              <w:spacing w:after="0"/>
+              <w:jc w:val="left"/>
+            </w:pPr>
+            <w:r>
+              <w:rPr>
+                <w:b w:val="false"/>
+                <w:bCs w:val="false"/>
+                <w:color w:val="000000"/>
+                <w:sz w:val="19"/>
+                <w:szCs w:val="19"/>
+              </w:rPr>
+              <w:t xml:space="preserve">$4.500 por estudiante/año — 54% por debajo</w:t>
+            </w:r>
+          </w:p>
+        </w:tc>
+      </w:tr>
+      <w:tr>
+        <w:trPr>
+          <w:tblHeader w:val="false"/>
+        </w:trPr>
+        <w:tc>
+          <w:tcPr>
+            <w:tcW w:type="dxa" w:w="3000"/>
+            <w:shd w:fill="F5F8FD" w:val="clear"/>
+            <w:tcMar>
+              <w:top w:type="dxa" w:w="60"/>
+              <w:left w:type="dxa" w:w="90"/>
+              <w:bottom w:type="dxa" w:w="60"/>
+              <w:right w:type="dxa" w:w="90"/>
+            </w:tcMar>
+          </w:tcPr>
+          <w:p>
+            <w:pPr>
+              <w:spacing w:after="0"/>
+              <w:jc w:val="left"/>
+            </w:pPr>
+            <w:r>
+              <w:rPr>
+                <w:b w:val="false"/>
+                <w:bCs w:val="false"/>
+                <w:color w:val="000000"/>
+                <w:sz w:val="19"/>
+                <w:szCs w:val="19"/>
+              </w:rPr>
               <w:t xml:space="preserve">SABIE — tramo grande</w:t>
             </w:r>
           </w:p>
@@ -6658,56 +6888,56 @@
         <w:tc>
           <w:tcPr>
             <w:tcW w:type="dxa" w:w="3000"/>
-            <w:shd w:fill="FFFFFF" w:val="clear"/>
-            <w:tcMar>
-              <w:top w:type="dxa" w:w="60"/>
-              <w:left w:type="dxa" w:w="90"/>
-              <w:bottom w:type="dxa" w:w="60"/>
-              <w:right w:type="dxa" w:w="90"/>
-            </w:tcMar>
-          </w:tcPr>
-          <w:p>
-            <w:pPr>
-              <w:spacing w:after="0"/>
-              <w:jc w:val="left"/>
-            </w:pPr>
-            <w:r>
-              <w:rPr>
-                <w:b w:val="false"/>
-                <w:bCs w:val="false"/>
-                <w:color w:val="000000"/>
-                <w:sz w:val="19"/>
-                <w:szCs w:val="19"/>
-              </w:rPr>
-              <w:t xml:space="preserve">$11.500.000</w:t>
+            <w:shd w:fill="F5F8FD" w:val="clear"/>
+            <w:tcMar>
+              <w:top w:type="dxa" w:w="60"/>
+              <w:left w:type="dxa" w:w="90"/>
+              <w:bottom w:type="dxa" w:w="60"/>
+              <w:right w:type="dxa" w:w="90"/>
+            </w:tcMar>
+          </w:tcPr>
+          <w:p>
+            <w:pPr>
+              <w:spacing w:after="0"/>
+              <w:jc w:val="left"/>
+            </w:pPr>
+            <w:r>
+              <w:rPr>
+                <w:b w:val="false"/>
+                <w:bCs w:val="false"/>
+                <w:color w:val="000000"/>
+                <w:sz w:val="19"/>
+                <w:szCs w:val="19"/>
+              </w:rPr>
+              <w:t xml:space="preserve">$8.100.000</w:t>
             </w:r>
           </w:p>
         </w:tc>
         <w:tc>
           <w:tcPr>
             <w:tcW w:type="dxa" w:w="3000"/>
-            <w:shd w:fill="FFFFFF" w:val="clear"/>
-            <w:tcMar>
-              <w:top w:type="dxa" w:w="60"/>
-              <w:left w:type="dxa" w:w="90"/>
-              <w:bottom w:type="dxa" w:w="60"/>
-              <w:right w:type="dxa" w:w="90"/>
-            </w:tcMar>
-          </w:tcPr>
-          <w:p>
-            <w:pPr>
-              <w:spacing w:after="0"/>
-              <w:jc w:val="left"/>
-            </w:pPr>
-            <w:r>
-              <w:rPr>
-                <w:b w:val="false"/>
-                <w:bCs w:val="false"/>
-                <w:color w:val="000000"/>
-                <w:sz w:val="19"/>
-                <w:szCs w:val="19"/>
-              </w:rPr>
-              <w:t xml:space="preserve">$4.600 por estudiante/año</w:t>
+            <w:shd w:fill="F5F8FD" w:val="clear"/>
+            <w:tcMar>
+              <w:top w:type="dxa" w:w="60"/>
+              <w:left w:type="dxa" w:w="90"/>
+              <w:bottom w:type="dxa" w:w="60"/>
+              <w:right w:type="dxa" w:w="90"/>
+            </w:tcMar>
+          </w:tcPr>
+          <w:p>
+            <w:pPr>
+              <w:spacing w:after="0"/>
+              <w:jc w:val="left"/>
+            </w:pPr>
+            <w:r>
+              <w:rPr>
+                <w:b w:val="false"/>
+                <w:bCs w:val="false"/>
+                <w:color w:val="000000"/>
+                <w:sz w:val="19"/>
+                <w:szCs w:val="19"/>
+              </w:rPr>
+              <w:t xml:space="preserve">$3.240 por estudiante/año — 67% por debajo</w:t>
             </w:r>
           </w:p>
         </w:tc>
@@ -6715,7 +6945,7 @@
     </w:tbl>
     <w:p>
       <w:r>
-        <w:t xml:space="preserve">SABIE se ubica en el rango del mercado en instituciones pequeñas y resulta claramente más competitivo en instituciones grandes, donde la escala favorece el precio por estudiante. A esto se suma que la inteligencia artificial no genera cobro adicional.</w:t>
+        <w:t xml:space="preserve">SABIE queda por debajo de la referencia de mercado en todos los tramos, y la ventaja crece con el tamaño de la institución. A esto se suma que la inteligencia artificial no genera cobro adicional y que la plataforma funciona sin conexión permanente a internet, algo que las alternativas basadas en navegador no ofrecen.</w:t>
       </w:r>
     </w:p>
     <w:p>
@@ -7991,7 +8221,7 @@
                 <w:sz w:val="19"/>
                 <w:szCs w:val="19"/>
               </w:rPr>
-              <w:t xml:space="preserve">20%</w:t>
+              <w:t xml:space="preserve">15%</w:t>
             </w:r>
           </w:p>
         </w:tc>
@@ -8080,7 +8310,7 @@
                 <w:sz w:val="19"/>
                 <w:szCs w:val="19"/>
               </w:rPr>
-              <w:t xml:space="preserve">10%</w:t>
+              <w:t xml:space="preserve">8%</w:t>
             </w:r>
           </w:p>
         </w:tc>
@@ -8307,7 +8537,7 @@
     </w:p>
     <w:p>
       <w:r>
-        <w:t xml:space="preserve">Con los precios propuestos, cinco instituciones vinculadas representan un margen aproximado de $13.800.000 anuales con una dedicación cercana a 360 horas, equivalente a unas siete horas semanales.</w:t>
+        <w:t xml:space="preserve">Con los precios propuestos, cinco instituciones vinculadas representan un margen aproximado de $9.500.000 anuales con una dedicación cercana a 232 horas, equivalente a unas cinco horas semanales. El precio por estudiante queda entre un 39% y un 67% por debajo de la referencia nacional comparable.</w:t>
       </w:r>
     </w:p>
     <w:p>

</xml_diff>